<commit_message>
Add design flowchart to README and report
Co-Authored-By: Claude Opus 5.5 <noreply@anthropic.com>
Claude-Session: https://claude.ai/code/session_01NWuP97XuxRF3YUECK7sHWt
</commit_message>
<xml_diff>
--- a/docs/StudentShield_Project_Report.docx
+++ b/docs/StudentShield_Project_Report.docx
@@ -2,7 +2,7 @@
 <file path=word/document.xml><?xml version="1.0" encoding="utf-8"?>
 <w:document xmlns:w="http://schemas.openxmlformats.org/wordprocessingml/2006/main" xmlns:m="http://schemas.openxmlformats.org/officeDocument/2006/math" xmlns:r="http://schemas.openxmlformats.org/officeDocument/2006/relationships" xmlns:o="urn:schemas-microsoft-com:office:office" xmlns:v="urn:schemas-microsoft-com:vml" xmlns:w10="urn:schemas-microsoft-com:office:word" xmlns:a="http://schemas.openxmlformats.org/drawingml/2006/main" xmlns:pic="http://schemas.openxmlformats.org/drawingml/2006/picture" xmlns:wp="http://schemas.openxmlformats.org/drawingml/2006/wordprocessingDrawing">
   <w:body>
-    <w:bookmarkStart w:id="65" w:name="X8d805a9bd98c36d0a93ad201b67fe0b3d81ba11"/>
+    <w:bookmarkStart w:id="68" w:name="X8d805a9bd98c36d0a93ad201b67fe0b3d81ba11"/>
     <w:p>
       <w:pPr>
         <w:pStyle w:val="Title"/>
@@ -2033,7 +2033,7 @@
       </w:r>
     </w:p>
     <w:bookmarkEnd w:id="28"/>
-    <w:bookmarkStart w:id="32" w:name="architecture"/>
+    <w:bookmarkStart w:id="35" w:name="architecture"/>
     <w:p>
       <w:pPr>
         <w:pStyle w:val="Heading2"/>
@@ -2118,11 +2118,84 @@
         <w:pStyle w:val="BodyText"/>
       </w:pPr>
       <w:r>
+        <w:rPr>
+          <w:bCs/>
+          <w:b/>
+        </w:rPr>
+        <w:t xml:space="preserve">Design flowchart.</w:t>
+      </w:r>
+      <w:r>
+        <w:t xml:space="preserve"> </w:t>
+      </w:r>
+      <w:r>
+        <w:t xml:space="preserve">How the model is built (top) and what happens to each payment as it lands (bottom).</w:t>
+      </w:r>
+    </w:p>
+    <w:p>
+      <w:pPr>
+        <w:pStyle w:val="CaptionedFigure"/>
+      </w:pPr>
+      <w:r>
+        <w:drawing>
+          <wp:inline>
+            <wp:extent cx="5334000" cy="3333750"/>
+            <wp:effectExtent b="0" l="0" r="0" t="0"/>
+            <wp:docPr descr="Design flowchart" title="" id="33" name="Picture"/>
+            <a:graphic>
+              <a:graphicData uri="http://schemas.openxmlformats.org/drawingml/2006/picture">
+                <pic:pic>
+                  <pic:nvPicPr>
+                    <pic:cNvPr descr="StudentShield_flowchart.png" id="34" name="Picture"/>
+                    <pic:cNvPicPr>
+                      <a:picLocks noChangeArrowheads="1" noChangeAspect="1"/>
+                    </pic:cNvPicPr>
+                  </pic:nvPicPr>
+                  <pic:blipFill>
+                    <a:blip r:embed="rId32"/>
+                    <a:stretch>
+                      <a:fillRect/>
+                    </a:stretch>
+                  </pic:blipFill>
+                  <pic:spPr bwMode="auto">
+                    <a:xfrm>
+                      <a:off x="0" y="0"/>
+                      <a:ext cx="5334000" cy="3333750"/>
+                    </a:xfrm>
+                    <a:prstGeom prst="rect">
+                      <a:avLst/>
+                    </a:prstGeom>
+                    <a:noFill/>
+                    <a:ln w="9525">
+                      <a:noFill/>
+                      <a:headEnd/>
+                      <a:tailEnd/>
+                    </a:ln>
+                  </pic:spPr>
+                </pic:pic>
+              </a:graphicData>
+            </a:graphic>
+          </wp:inline>
+        </w:drawing>
+      </w:r>
+    </w:p>
+    <w:p>
+      <w:pPr>
+        <w:pStyle w:val="ImageCaption"/>
+      </w:pPr>
+      <w:r>
+        <w:t xml:space="preserve">Design flowchart</w:t>
+      </w:r>
+    </w:p>
+    <w:p>
+      <w:pPr>
+        <w:pStyle w:val="BodyText"/>
+      </w:pPr>
+      <w:r>
         <w:t xml:space="preserve">The notebook exports the trained model, thresholds and test-day replay to a shared folder that mule-service reads at start. The web app sends each payment to mule-service over mule-net. Granite is shown as optional: it would be called only when an explanation is opened, and no Granite server ran in the final build, so explanations come from templates.</w:t>
       </w:r>
     </w:p>
-    <w:bookmarkEnd w:id="32"/>
-    <w:bookmarkStart w:id="35" w:name="data"/>
+    <w:bookmarkEnd w:id="35"/>
+    <w:bookmarkStart w:id="38" w:name="data"/>
     <w:p>
       <w:pPr>
         <w:pStyle w:val="Heading2"/>
@@ -3099,7 +3172,7 @@
         <w:t xml:space="preserve">The results show the approach works. Real-world accuracy would need real bank data.</w:t>
       </w:r>
     </w:p>
-    <w:bookmarkStart w:id="34" w:name="why-this-dataset"/>
+    <w:bookmarkStart w:id="37" w:name="why-this-dataset"/>
     <w:p>
       <w:pPr>
         <w:pStyle w:val="Heading3"/>
@@ -3133,7 +3206,7 @@
       <w:r>
         <w:t xml:space="preserve">Real transaction data isn’t available to students, for legal, privacy and competitive reasons. Even inside a bank its labels are incomplete: undetected laundering sits in the data marked as normal, and each bank sees only its own side of a chain that crosses banks. IBM’s generator knows where every pound came from, so every laundering payment is labelled, including the ones a bank would miss (</w:t>
       </w:r>
-      <w:hyperlink r:id="rId33">
+      <w:hyperlink r:id="rId36">
         <w:r>
           <w:rPr>
             <w:rStyle w:val="Hyperlink"/>
@@ -3534,9 +3607,9 @@
         <w:t xml:space="preserve">.</w:t>
       </w:r>
     </w:p>
-    <w:bookmarkEnd w:id="34"/>
-    <w:bookmarkEnd w:id="35"/>
-    <w:bookmarkStart w:id="36" w:name="features"/>
+    <w:bookmarkEnd w:id="37"/>
+    <w:bookmarkEnd w:id="38"/>
+    <w:bookmarkStart w:id="39" w:name="features"/>
     <w:p>
       <w:pPr>
         <w:pStyle w:val="Heading2"/>
@@ -4755,8 +4828,8 @@
         <w:t xml:space="preserve">Sender fan-out is our strongest early-warning signal. If a sender is paying many new accounts, every receiver is at risk, including a first-time mule with a clean history.</w:t>
       </w:r>
     </w:p>
-    <w:bookmarkEnd w:id="36"/>
-    <w:bookmarkStart w:id="37" w:name="evaluation-method"/>
+    <w:bookmarkEnd w:id="39"/>
+    <w:bookmarkStart w:id="40" w:name="evaluation-method"/>
     <w:p>
       <w:pPr>
         <w:pStyle w:val="Heading2"/>
@@ -5357,8 +5430,8 @@
         <w:t xml:space="preserve">is 99.9% accurate and useless.</w:t>
       </w:r>
     </w:p>
-    <w:bookmarkEnd w:id="37"/>
-    <w:bookmarkStart w:id="42" w:name="models-and-results"/>
+    <w:bookmarkEnd w:id="40"/>
+    <w:bookmarkStart w:id="45" w:name="models-and-results"/>
     <w:p>
       <w:pPr>
         <w:pStyle w:val="Heading2"/>
@@ -6240,18 +6313,18 @@
           <wp:inline>
             <wp:extent cx="5334000" cy="2470484"/>
             <wp:effectExtent b="0" l="0" r="0" t="0"/>
-            <wp:docPr descr="Final model feature importance" title="" id="39" name="Picture"/>
+            <wp:docPr descr="Final model feature importance" title="" id="42" name="Picture"/>
             <a:graphic>
               <a:graphicData uri="http://schemas.openxmlformats.org/drawingml/2006/picture">
                 <pic:pic>
                   <pic:nvPicPr>
-                    <pic:cNvPr descr="feature_importance.png" id="40" name="Picture"/>
+                    <pic:cNvPr descr="feature_importance.png" id="43" name="Picture"/>
                     <pic:cNvPicPr>
                       <a:picLocks noChangeArrowheads="1" noChangeAspect="1"/>
                     </pic:cNvPicPr>
                   </pic:nvPicPr>
                   <pic:blipFill>
-                    <a:blip r:embed="rId38"/>
+                    <a:blip r:embed="rId41"/>
                     <a:stretch>
                       <a:fillRect/>
                     </a:stretch>
@@ -6383,7 +6456,7 @@
         <w:t xml:space="preserve">, as in all real fraud systems. That shaped the product: the student is contacted only at a much stricter cut-off (see Alert levels).</w:t>
       </w:r>
     </w:p>
-    <w:bookmarkStart w:id="41" w:name="Xd6928da38c14f9072e8e73b340285bb7237ecd5"/>
+    <w:bookmarkStart w:id="44" w:name="Xd6928da38c14f9072e8e73b340285bb7237ecd5"/>
     <w:p>
       <w:pPr>
         <w:pStyle w:val="Heading3"/>
@@ -6515,9 +6588,9 @@
         <w:t xml:space="preserve">recall at 1% rose from 59.3% to 69.5% and PR-AUC from 0.303 to 0.430. The gap between validation and test shrank (77.7%→59.3% before, 77.9%→69.5% now), which suggests the model generalises better to later days.</w:t>
       </w:r>
     </w:p>
-    <w:bookmarkEnd w:id="41"/>
-    <w:bookmarkEnd w:id="42"/>
-    <w:bookmarkStart w:id="43" w:name="alert-levels"/>
+    <w:bookmarkEnd w:id="44"/>
+    <w:bookmarkEnd w:id="45"/>
+    <w:bookmarkStart w:id="46" w:name="alert-levels"/>
     <w:p>
       <w:pPr>
         <w:pStyle w:val="Heading2"/>
@@ -7165,8 +7238,8 @@
         <w:t xml:space="preserve">The threshold sweep chart (threshold_sweep.png) shows recall and precision at every possible cut-off, so a bank with more analysts can choose a looser one.</w:t>
       </w:r>
     </w:p>
-    <w:bookmarkEnd w:id="43"/>
-    <w:bookmarkStart w:id="44" w:name="explanations"/>
+    <w:bookmarkEnd w:id="46"/>
+    <w:bookmarkStart w:id="47" w:name="explanations"/>
     <w:p>
       <w:pPr>
         <w:pStyle w:val="Heading2"/>
@@ -7407,8 +7480,8 @@
         <w:t xml:space="preserve">.</w:t>
       </w:r>
     </w:p>
-    <w:bookmarkEnd w:id="44"/>
-    <w:bookmarkStart w:id="45" w:name="the-web-app-and-demos"/>
+    <w:bookmarkEnd w:id="47"/>
+    <w:bookmarkStart w:id="48" w:name="the-web-app-and-demos"/>
     <w:p>
       <w:pPr>
         <w:pStyle w:val="Heading2"/>
@@ -7915,8 +7988,8 @@
         <w:t xml:space="preserve">on LinuxONE.</w:t>
       </w:r>
     </w:p>
-    <w:bookmarkEnd w:id="45"/>
-    <w:bookmarkStart w:id="47" w:name="running-it-on-linuxone"/>
+    <w:bookmarkEnd w:id="48"/>
+    <w:bookmarkStart w:id="50" w:name="running-it-on-linuxone"/>
     <w:p>
       <w:pPr>
         <w:pStyle w:val="Heading2"/>
@@ -8709,7 +8782,7 @@
         <w:t xml:space="preserve">most of the world’s card and bank transactions already run on IBM Z, so scoring them in place avoids copying sensitive data elsewhere. The Telum processor’s on-chip AI accelerator is designed for inference inside the transaction, which is exactly the window StudentShield needs.</w:t>
       </w:r>
     </w:p>
-    <w:bookmarkStart w:id="46" w:name="X7ad8f1fad62307f79748d4b1cdfb3bdf3be5d8a"/>
+    <w:bookmarkStart w:id="49" w:name="X7ad8f1fad62307f79748d4b1cdfb3bdf3be5d8a"/>
     <w:p>
       <w:pPr>
         <w:pStyle w:val="Heading3"/>
@@ -8948,9 +9021,9 @@
         <w:t xml:space="preserve">The same containers can be given more vCPUs and memory on LinuxONE, and inference could move onto the Telum processor’s on-chip AI accelerator for in-transaction scoring at bank volumes. We did not test the accelerator in this build.</w:t>
       </w:r>
     </w:p>
-    <w:bookmarkEnd w:id="46"/>
-    <w:bookmarkEnd w:id="47"/>
-    <w:bookmarkStart w:id="48" w:name="responsible-design"/>
+    <w:bookmarkEnd w:id="49"/>
+    <w:bookmarkEnd w:id="50"/>
+    <w:bookmarkStart w:id="51" w:name="responsible-design"/>
     <w:p>
       <w:pPr>
         <w:pStyle w:val="Heading2"/>
@@ -9169,8 +9242,8 @@
         <w:t xml:space="preserve">Payments are scored on the platform where they live, and any language model would run on the same VM. Nothing is sent to an outside service.</w:t>
       </w:r>
     </w:p>
-    <w:bookmarkEnd w:id="48"/>
-    <w:bookmarkStart w:id="49" w:name="ethical-considerations"/>
+    <w:bookmarkEnd w:id="51"/>
+    <w:bookmarkStart w:id="52" w:name="ethical-considerations"/>
     <w:p>
       <w:pPr>
         <w:pStyle w:val="Heading2"/>
@@ -9413,8 +9486,8 @@
         <w:t xml:space="preserve">XGBoost trains in 19.0 s on 3 CPUs with no GPU, and no language model runs in the scoring path.</w:t>
       </w:r>
     </w:p>
-    <w:bookmarkEnd w:id="49"/>
-    <w:bookmarkStart w:id="50" w:name="decisions-that-changed-during-the-build"/>
+    <w:bookmarkEnd w:id="52"/>
+    <w:bookmarkStart w:id="53" w:name="decisions-that-changed-during-the-build"/>
     <w:p>
       <w:pPr>
         <w:pStyle w:val="Heading2"/>
@@ -10524,8 +10597,8 @@
         </w:tc>
       </w:tr>
     </w:tbl>
-    <w:bookmarkEnd w:id="50"/>
-    <w:bookmarkStart w:id="51" w:name="roads-not-taken"/>
+    <w:bookmarkEnd w:id="53"/>
+    <w:bookmarkStart w:id="54" w:name="roads-not-taken"/>
     <w:p>
       <w:pPr>
         <w:pStyle w:val="Heading2"/>
@@ -11734,8 +11807,8 @@
         </w:tc>
       </w:tr>
     </w:tbl>
-    <w:bookmarkEnd w:id="51"/>
-    <w:bookmarkStart w:id="52" w:name="limitations-and-next-steps"/>
+    <w:bookmarkEnd w:id="54"/>
+    <w:bookmarkStart w:id="55" w:name="limitations-and-next-steps"/>
     <w:p>
       <w:pPr>
         <w:pStyle w:val="Heading2"/>
@@ -12148,8 +12221,8 @@
         <w:t xml:space="preserve">Test the warning wording with real students.</w:t>
       </w:r>
     </w:p>
-    <w:bookmarkEnd w:id="52"/>
-    <w:bookmarkStart w:id="64" w:name="references-and-open-source-used"/>
+    <w:bookmarkEnd w:id="55"/>
+    <w:bookmarkStart w:id="67" w:name="references-and-open-source-used"/>
     <w:p>
       <w:pPr>
         <w:pStyle w:val="Heading2"/>
@@ -12262,7 +12335,7 @@
       <w:r>
         <w:t xml:space="preserve"> </w:t>
       </w:r>
-      <w:hyperlink r:id="rId33">
+      <w:hyperlink r:id="rId36">
         <w:r>
           <w:rPr>
             <w:rStyle w:val="Hyperlink"/>
@@ -12314,7 +12387,7 @@
         </w:numPr>
         <w:pStyle w:val="Compact"/>
       </w:pPr>
-      <w:hyperlink r:id="rId53">
+      <w:hyperlink r:id="rId56">
         <w:r>
           <w:rPr>
             <w:rStyle w:val="Hyperlink"/>
@@ -12334,7 +12407,7 @@
         </w:numPr>
         <w:pStyle w:val="Compact"/>
       </w:pPr>
-      <w:hyperlink r:id="rId54">
+      <w:hyperlink r:id="rId57">
         <w:r>
           <w:rPr>
             <w:rStyle w:val="Hyperlink"/>
@@ -12413,7 +12486,7 @@
         </w:numPr>
         <w:pStyle w:val="Compact"/>
       </w:pPr>
-      <w:hyperlink r:id="rId55">
+      <w:hyperlink r:id="rId58">
         <w:r>
           <w:rPr>
             <w:rStyle w:val="Hyperlink"/>
@@ -12436,7 +12509,7 @@
         </w:numPr>
         <w:pStyle w:val="Compact"/>
       </w:pPr>
-      <w:hyperlink r:id="rId56">
+      <w:hyperlink r:id="rId59">
         <w:r>
           <w:rPr>
             <w:rStyle w:val="Hyperlink"/>
@@ -12459,7 +12532,7 @@
         </w:numPr>
         <w:pStyle w:val="Compact"/>
       </w:pPr>
-      <w:hyperlink r:id="rId57">
+      <w:hyperlink r:id="rId60">
         <w:r>
           <w:rPr>
             <w:rStyle w:val="Hyperlink"/>
@@ -12476,7 +12549,7 @@
       <w:r>
         <w:t xml:space="preserve"> </w:t>
       </w:r>
-      <w:hyperlink r:id="rId58">
+      <w:hyperlink r:id="rId61">
         <w:r>
           <w:rPr>
             <w:rStyle w:val="Hyperlink"/>
@@ -12499,7 +12572,7 @@
         </w:numPr>
         <w:pStyle w:val="Compact"/>
       </w:pPr>
-      <w:hyperlink r:id="rId59">
+      <w:hyperlink r:id="rId62">
         <w:r>
           <w:rPr>
             <w:rStyle w:val="Hyperlink"/>
@@ -12522,7 +12595,7 @@
         </w:numPr>
         <w:pStyle w:val="Compact"/>
       </w:pPr>
-      <w:hyperlink r:id="rId60">
+      <w:hyperlink r:id="rId63">
         <w:r>
           <w:rPr>
             <w:rStyle w:val="Hyperlink"/>
@@ -12545,7 +12618,7 @@
         </w:numPr>
         <w:pStyle w:val="Compact"/>
       </w:pPr>
-      <w:hyperlink r:id="rId61">
+      <w:hyperlink r:id="rId64">
         <w:r>
           <w:rPr>
             <w:rStyle w:val="Hyperlink"/>
@@ -12568,7 +12641,7 @@
         </w:numPr>
         <w:pStyle w:val="Compact"/>
       </w:pPr>
-      <w:hyperlink r:id="rId62">
+      <w:hyperlink r:id="rId65">
         <w:r>
           <w:rPr>
             <w:rStyle w:val="Hyperlink"/>
@@ -12591,7 +12664,7 @@
         </w:numPr>
         <w:pStyle w:val="Compact"/>
       </w:pPr>
-      <w:hyperlink r:id="rId63">
+      <w:hyperlink r:id="rId66">
         <w:r>
           <w:rPr>
             <w:rStyle w:val="Hyperlink"/>
@@ -12621,8 +12694,8 @@
         <w:t xml:space="preserve">Parts of the code and documentation were written with help from AI assistants.</w:t>
       </w:r>
     </w:p>
-    <w:bookmarkEnd w:id="64"/>
-    <w:bookmarkEnd w:id="65"/>
+    <w:bookmarkEnd w:id="67"/>
+    <w:bookmarkEnd w:id="68"/>
     <w:sectPr>
       <w:pgMar w:left="1296" w:right="1296" w:top="1152" w:bottom="1152"/>
     </w:sectPr>

</xml_diff>

<commit_message>
Screenshots from the live system: README section, report appendix, deck evidence slides
Co-Authored-By: Claude Opus 5.5 <noreply@anthropic.com>
Claude-Session: https://claude.ai/code/session_01NWuP97XuxRF3YUECK7sHWt
</commit_message>
<xml_diff>
--- a/docs/StudentShield_Project_Report.docx
+++ b/docs/StudentShield_Project_Report.docx
@@ -2,7 +2,7 @@
 <file path=word/document.xml><?xml version="1.0" encoding="utf-8"?>
 <w:document xmlns:w="http://schemas.openxmlformats.org/wordprocessingml/2006/main" xmlns:m="http://schemas.openxmlformats.org/officeDocument/2006/math" xmlns:r="http://schemas.openxmlformats.org/officeDocument/2006/relationships" xmlns:o="urn:schemas-microsoft-com:office:office" xmlns:v="urn:schemas-microsoft-com:vml" xmlns:w10="urn:schemas-microsoft-com:office:word" xmlns:a="http://schemas.openxmlformats.org/drawingml/2006/main" xmlns:pic="http://schemas.openxmlformats.org/drawingml/2006/picture" xmlns:wp="http://schemas.openxmlformats.org/drawingml/2006/wordprocessingDrawing">
   <w:body>
-    <w:bookmarkStart w:id="68" w:name="X8d805a9bd98c36d0a93ad201b67fe0b3d81ba11"/>
+    <w:bookmarkStart w:id="93" w:name="X8d805a9bd98c36d0a93ad201b67fe0b3d81ba11"/>
     <w:p>
       <w:pPr>
         <w:pStyle w:val="Title"/>
@@ -466,7 +466,7 @@
                 <w:b/>
                 <w:sz w:val="19"/>
               </w:rPr>
-              <w:t xml:space="preserve">1 ms</w:t>
+              <w:t xml:space="preserve">0.5 ms</w:t>
             </w:r>
             <w:r>
               <w:rPr>
@@ -478,7 +478,7 @@
               <w:rPr>
                 <w:sz w:val="19"/>
               </w:rPr>
-              <w:t xml:space="preserve">per payment</w:t>
+              <w:t xml:space="preserve">per payment (0.55 ms measured in /live)</w:t>
             </w:r>
           </w:p>
         </w:tc>
@@ -647,7 +647,7 @@
               <w:rPr>
                 <w:sz w:val="19"/>
               </w:rPr>
-              <w:t xml:space="preserve">Theme 1, real-time AI: scoring at about 1 ms as each payment lands (Summary). A sourced problem in the age group most affected (The problem). Clear beneficiaries: students warned before they commit a crime, victims whose money can still be held, analysts with smaller, better queues (Our solution, Alert levels)</w:t>
+              <w:t xml:space="preserve">Theme 1, real-time AI: scoring in about 0.5 ms as each payment lands (Summary). A sourced problem in the age group most affected (The problem). Clear beneficiaries: students warned before they commit a crime, victims whose money can still be held, analysts with smaller, better queues (Our solution, Alert levels)</w:t>
             </w:r>
           </w:p>
         </w:tc>
@@ -7793,7 +7793,7 @@
               <w:rPr>
                 <w:sz w:val="19"/>
               </w:rPr>
-              <w:t xml:space="preserve">All replayed test-day payments in time order at 5–100 per second, with live alerts, catch rate, false alarms and latency (about 1 ms per payment)</w:t>
+              <w:t xml:space="preserve">All replayed test-day payments in time order at 5–100 per second, with live alerts, catch rate, false alarms and latency (0.55 ms per payment on average)</w:t>
             </w:r>
           </w:p>
         </w:tc>
@@ -8754,7 +8754,7 @@
         <w:t xml:space="preserve"> </w:t>
       </w:r>
       <w:r>
-        <w:t xml:space="preserve">XGBoost trains on 2.09M payments in 19.0 s and scores in about 1 ms, on 3 vCPUs with no GPU.</w:t>
+        <w:t xml:space="preserve">XGBoost trains on 2.09M payments in 19.0 s and scores in about 0.5 ms, on 3 vCPUs with no GPU.</w:t>
       </w:r>
       <w:r>
         <w:br/>
@@ -8918,7 +8918,7 @@
         <w:t xml:space="preserve"> </w:t>
       </w:r>
       <w:r>
-        <w:t xml:space="preserve">Each /score call needs only that payment’s features and the loaded model, and takes about 1 ms. One process can therefore score in the order of 1,000 payments a second, and more mule-service replicas can sit behind the same network name to add capacity.</w:t>
+        <w:t xml:space="preserve">Each /score call needs only that payment’s features and the loaded model, and takes about 0.5 ms. One process can therefore score in the order of 1,000 payments a second, and more mule-service replicas can sit behind the same network name to add capacity.</w:t>
       </w:r>
       <w:r>
         <w:br/>
@@ -12695,7 +12695,574 @@
       </w:r>
     </w:p>
     <w:bookmarkEnd w:id="67"/>
-    <w:bookmarkEnd w:id="68"/>
+    <w:bookmarkStart w:id="92" w:name="Xfc6ebf94ea804b2f44976b500b76ce99b440b82"/>
+    <w:p>
+      <w:pPr>
+        <w:pStyle w:val="Heading2"/>
+      </w:pPr>
+      <w:r>
+        <w:t xml:space="preserve">Appendix: screenshots from the live system</w:t>
+      </w:r>
+    </w:p>
+    <w:p>
+      <w:pPr>
+        <w:pStyle w:val="FirstParagraph"/>
+      </w:pPr>
+      <w:r>
+        <w:t xml:space="preserve">All taken on 18 October 2026 from the running system on IBM LinuxONE.</w:t>
+      </w:r>
+    </w:p>
+    <w:p>
+      <w:pPr>
+        <w:pStyle w:val="BodyText"/>
+      </w:pPr>
+      <w:r>
+        <w:rPr>
+          <w:bCs/>
+          <w:b/>
+        </w:rPr>
+        <w:t xml:space="preserve">LinuxONE Community Cloud: the HulmeAI virtual server, active, at 148.100.108.113.</w:t>
+      </w:r>
+    </w:p>
+    <w:p>
+      <w:pPr>
+        <w:pStyle w:val="BodyText"/>
+      </w:pPr>
+      <w:r>
+        <w:drawing>
+          <wp:inline>
+            <wp:extent cx="5334000" cy="1719384"/>
+            <wp:effectExtent b="0" l="0" r="0" t="0"/>
+            <wp:docPr descr="" title="" id="69" name="Picture"/>
+            <a:graphic>
+              <a:graphicData uri="http://schemas.openxmlformats.org/drawingml/2006/picture">
+                <pic:pic>
+                  <pic:nvPicPr>
+                    <pic:cNvPr descr="01_linuxone_dashboard.png" id="70" name="Picture"/>
+                    <pic:cNvPicPr>
+                      <a:picLocks noChangeArrowheads="1" noChangeAspect="1"/>
+                    </pic:cNvPicPr>
+                  </pic:nvPicPr>
+                  <pic:blipFill>
+                    <a:blip r:embed="rId68"/>
+                    <a:stretch>
+                      <a:fillRect/>
+                    </a:stretch>
+                  </pic:blipFill>
+                  <pic:spPr bwMode="auto">
+                    <a:xfrm>
+                      <a:off x="0" y="0"/>
+                      <a:ext cx="5334000" cy="1719384"/>
+                    </a:xfrm>
+                    <a:prstGeom prst="rect">
+                      <a:avLst/>
+                    </a:prstGeom>
+                    <a:noFill/>
+                    <a:ln w="9525">
+                      <a:noFill/>
+                      <a:headEnd/>
+                      <a:tailEnd/>
+                    </a:ln>
+                  </pic:spPr>
+                </pic:pic>
+              </a:graphicData>
+            </a:graphic>
+          </wp:inline>
+        </w:drawing>
+      </w:r>
+    </w:p>
+    <w:p>
+      <w:pPr>
+        <w:pStyle w:val="BodyText"/>
+      </w:pPr>
+      <w:r>
+        <w:rPr>
+          <w:bCs/>
+          <w:b/>
+        </w:rPr>
+        <w:t xml:space="preserve">The live scoring service’s /health endpoint: machine s390x, 25 features, both cut-offs, template explanations.</w:t>
+      </w:r>
+    </w:p>
+    <w:p>
+      <w:pPr>
+        <w:pStyle w:val="BodyText"/>
+      </w:pPr>
+      <w:r>
+        <w:drawing>
+          <wp:inline>
+            <wp:extent cx="5334000" cy="289441"/>
+            <wp:effectExtent b="0" l="0" r="0" t="0"/>
+            <wp:docPr descr="" title="" id="72" name="Picture"/>
+            <a:graphic>
+              <a:graphicData uri="http://schemas.openxmlformats.org/drawingml/2006/picture">
+                <pic:pic>
+                  <pic:nvPicPr>
+                    <pic:cNvPr descr="02_health.png" id="73" name="Picture"/>
+                    <pic:cNvPicPr>
+                      <a:picLocks noChangeArrowheads="1" noChangeAspect="1"/>
+                    </pic:cNvPicPr>
+                  </pic:nvPicPr>
+                  <pic:blipFill>
+                    <a:blip r:embed="rId71"/>
+                    <a:stretch>
+                      <a:fillRect/>
+                    </a:stretch>
+                  </pic:blipFill>
+                  <pic:spPr bwMode="auto">
+                    <a:xfrm>
+                      <a:off x="0" y="0"/>
+                      <a:ext cx="5334000" cy="289441"/>
+                    </a:xfrm>
+                    <a:prstGeom prst="rect">
+                      <a:avLst/>
+                    </a:prstGeom>
+                    <a:noFill/>
+                    <a:ln w="9525">
+                      <a:noFill/>
+                      <a:headEnd/>
+                      <a:tailEnd/>
+                    </a:ln>
+                  </pic:spPr>
+                </pic:pic>
+              </a:graphicData>
+            </a:graphic>
+          </wp:inline>
+        </w:drawing>
+      </w:r>
+    </w:p>
+    <w:p>
+      <w:pPr>
+        <w:pStyle w:val="BodyText"/>
+      </w:pPr>
+      <w:r>
+        <w:rPr>
+          <w:bCs/>
+          <w:b/>
+        </w:rPr>
+        <w:t xml:space="preserve">Notebook 03 on LinuxONE: XGBoost trained on s390x in 19.0 s; validation recall at 1% 0.779, PR-AUC 0.452.</w:t>
+      </w:r>
+    </w:p>
+    <w:p>
+      <w:pPr>
+        <w:pStyle w:val="BodyText"/>
+      </w:pPr>
+      <w:r>
+        <w:drawing>
+          <wp:inline>
+            <wp:extent cx="5334000" cy="3006271"/>
+            <wp:effectExtent b="0" l="0" r="0" t="0"/>
+            <wp:docPr descr="" title="" id="75" name="Picture"/>
+            <a:graphic>
+              <a:graphicData uri="http://schemas.openxmlformats.org/drawingml/2006/picture">
+                <pic:pic>
+                  <pic:nvPicPr>
+                    <pic:cNvPr descr="03_notebook03_training.png" id="76" name="Picture"/>
+                    <pic:cNvPicPr>
+                      <a:picLocks noChangeArrowheads="1" noChangeAspect="1"/>
+                    </pic:cNvPicPr>
+                  </pic:nvPicPr>
+                  <pic:blipFill>
+                    <a:blip r:embed="rId74"/>
+                    <a:stretch>
+                      <a:fillRect/>
+                    </a:stretch>
+                  </pic:blipFill>
+                  <pic:spPr bwMode="auto">
+                    <a:xfrm>
+                      <a:off x="0" y="0"/>
+                      <a:ext cx="5334000" cy="3006271"/>
+                    </a:xfrm>
+                    <a:prstGeom prst="rect">
+                      <a:avLst/>
+                    </a:prstGeom>
+                    <a:noFill/>
+                    <a:ln w="9525">
+                      <a:noFill/>
+                      <a:headEnd/>
+                      <a:tailEnd/>
+                    </a:ln>
+                  </pic:spPr>
+                </pic:pic>
+              </a:graphicData>
+            </a:graphic>
+          </wp:inline>
+        </w:drawing>
+      </w:r>
+    </w:p>
+    <w:p>
+      <w:pPr>
+        <w:pStyle w:val="BodyText"/>
+      </w:pPr>
+      <w:r>
+        <w:rPr>
+          <w:bCs/>
+          <w:b/>
+        </w:rPr>
+        <w:t xml:space="preserve">/demo: a real test-day case reaches the student level. The phone asks</w:t>
+      </w:r>
+      <w:r>
+        <w:rPr>
+          <w:bCs/>
+          <w:b/>
+        </w:rPr>
+        <w:t xml:space="preserve"> </w:t>
+      </w:r>
+      <w:r>
+        <w:rPr>
+          <w:bCs/>
+          <w:b/>
+        </w:rPr>
+        <w:t xml:space="preserve">“</w:t>
+      </w:r>
+      <w:r>
+        <w:rPr>
+          <w:bCs/>
+          <w:b/>
+        </w:rPr>
+        <w:t xml:space="preserve">Has someone asked you to move this money?</w:t>
+      </w:r>
+      <w:r>
+        <w:rPr>
+          <w:bCs/>
+          <w:b/>
+        </w:rPr>
+        <w:t xml:space="preserve">”</w:t>
+      </w:r>
+      <w:r>
+        <w:rPr>
+          <w:bCs/>
+          <w:b/>
+        </w:rPr>
+        <w:t xml:space="preserve"> </w:t>
+      </w:r>
+      <w:r>
+        <w:rPr>
+          <w:bCs/>
+          <w:b/>
+        </w:rPr>
+        <w:t xml:space="preserve">while the analyst sees the score, money flow and reasons.</w:t>
+      </w:r>
+    </w:p>
+    <w:p>
+      <w:pPr>
+        <w:pStyle w:val="BodyText"/>
+      </w:pPr>
+      <w:r>
+        <w:drawing>
+          <wp:inline>
+            <wp:extent cx="5334000" cy="3006271"/>
+            <wp:effectExtent b="0" l="0" r="0" t="0"/>
+            <wp:docPr descr="" title="" id="78" name="Picture"/>
+            <a:graphic>
+              <a:graphicData uri="http://schemas.openxmlformats.org/drawingml/2006/picture">
+                <pic:pic>
+                  <pic:nvPicPr>
+                    <pic:cNvPr descr="05_demo_student_warning.png" id="79" name="Picture"/>
+                    <pic:cNvPicPr>
+                      <a:picLocks noChangeArrowheads="1" noChangeAspect="1"/>
+                    </pic:cNvPicPr>
+                  </pic:nvPicPr>
+                  <pic:blipFill>
+                    <a:blip r:embed="rId77"/>
+                    <a:stretch>
+                      <a:fillRect/>
+                    </a:stretch>
+                  </pic:blipFill>
+                  <pic:spPr bwMode="auto">
+                    <a:xfrm>
+                      <a:off x="0" y="0"/>
+                      <a:ext cx="5334000" cy="3006271"/>
+                    </a:xfrm>
+                    <a:prstGeom prst="rect">
+                      <a:avLst/>
+                    </a:prstGeom>
+                    <a:noFill/>
+                    <a:ln w="9525">
+                      <a:noFill/>
+                      <a:headEnd/>
+                      <a:tailEnd/>
+                    </a:ln>
+                  </pic:spPr>
+                </pic:pic>
+              </a:graphicData>
+            </a:graphic>
+          </wp:inline>
+        </w:drawing>
+      </w:r>
+    </w:p>
+    <w:p>
+      <w:pPr>
+        <w:pStyle w:val="BodyText"/>
+      </w:pPr>
+      <w:r>
+        <w:rPr>
+          <w:bCs/>
+          <w:b/>
+        </w:rPr>
+        <w:t xml:space="preserve">/demo: a new flagged payment arrives after the student answered, so they are asked whether their answer still stands.</w:t>
+      </w:r>
+    </w:p>
+    <w:p>
+      <w:pPr>
+        <w:pStyle w:val="BodyText"/>
+      </w:pPr>
+      <w:r>
+        <w:drawing>
+          <wp:inline>
+            <wp:extent cx="5334000" cy="3006271"/>
+            <wp:effectExtent b="0" l="0" r="0" t="0"/>
+            <wp:docPr descr="" title="" id="81" name="Picture"/>
+            <a:graphic>
+              <a:graphicData uri="http://schemas.openxmlformats.org/drawingml/2006/picture">
+                <pic:pic>
+                  <pic:nvPicPr>
+                    <pic:cNvPr descr="06_demo_reask.png" id="82" name="Picture"/>
+                    <pic:cNvPicPr>
+                      <a:picLocks noChangeArrowheads="1" noChangeAspect="1"/>
+                    </pic:cNvPicPr>
+                  </pic:nvPicPr>
+                  <pic:blipFill>
+                    <a:blip r:embed="rId80"/>
+                    <a:stretch>
+                      <a:fillRect/>
+                    </a:stretch>
+                  </pic:blipFill>
+                  <pic:spPr bwMode="auto">
+                    <a:xfrm>
+                      <a:off x="0" y="0"/>
+                      <a:ext cx="5334000" cy="3006271"/>
+                    </a:xfrm>
+                    <a:prstGeom prst="rect">
+                      <a:avLst/>
+                    </a:prstGeom>
+                    <a:noFill/>
+                    <a:ln w="9525">
+                      <a:noFill/>
+                      <a:headEnd/>
+                      <a:tailEnd/>
+                    </a:ln>
+                  </pic:spPr>
+                </pic:pic>
+              </a:graphicData>
+            </a:graphic>
+          </wp:inline>
+        </w:drawing>
+      </w:r>
+    </w:p>
+    <w:p>
+      <w:pPr>
+        <w:pStyle w:val="BodyText"/>
+      </w:pPr>
+      <w:r>
+        <w:rPr>
+          <w:bCs/>
+          <w:b/>
+        </w:rPr>
+        <w:t xml:space="preserve">/demo: the student was warned 19 h 17 min before the money moved out, and the outbound transfer of 7,731 was held for review.</w:t>
+      </w:r>
+    </w:p>
+    <w:p>
+      <w:pPr>
+        <w:pStyle w:val="BodyText"/>
+      </w:pPr>
+      <w:r>
+        <w:drawing>
+          <wp:inline>
+            <wp:extent cx="5334000" cy="3006271"/>
+            <wp:effectExtent b="0" l="0" r="0" t="0"/>
+            <wp:docPr descr="" title="" id="84" name="Picture"/>
+            <a:graphic>
+              <a:graphicData uri="http://schemas.openxmlformats.org/drawingml/2006/picture">
+                <pic:pic>
+                  <pic:nvPicPr>
+                    <pic:cNvPr descr="07_demo_held_19h.png" id="85" name="Picture"/>
+                    <pic:cNvPicPr>
+                      <a:picLocks noChangeArrowheads="1" noChangeAspect="1"/>
+                    </pic:cNvPicPr>
+                  </pic:nvPicPr>
+                  <pic:blipFill>
+                    <a:blip r:embed="rId83"/>
+                    <a:stretch>
+                      <a:fillRect/>
+                    </a:stretch>
+                  </pic:blipFill>
+                  <pic:spPr bwMode="auto">
+                    <a:xfrm>
+                      <a:off x="0" y="0"/>
+                      <a:ext cx="5334000" cy="3006271"/>
+                    </a:xfrm>
+                    <a:prstGeom prst="rect">
+                      <a:avLst/>
+                    </a:prstGeom>
+                    <a:noFill/>
+                    <a:ln w="9525">
+                      <a:noFill/>
+                      <a:headEnd/>
+                      <a:tailEnd/>
+                    </a:ln>
+                  </pic:spPr>
+                </pic:pic>
+              </a:graphicData>
+            </a:graphic>
+          </wp:inline>
+        </w:drawing>
+      </w:r>
+    </w:p>
+    <w:p>
+      <w:pPr>
+        <w:pStyle w:val="BodyText"/>
+      </w:pPr>
+      <w:r>
+        <w:rPr>
+          <w:bCs/>
+          <w:b/>
+        </w:rPr>
+        <w:t xml:space="preserve">/live: full replay of the unseen test days on LinuxONE, averaging 0.55 ms per payment.</w:t>
+      </w:r>
+    </w:p>
+    <w:p>
+      <w:pPr>
+        <w:pStyle w:val="BodyText"/>
+      </w:pPr>
+      <w:r>
+        <w:drawing>
+          <wp:inline>
+            <wp:extent cx="5334000" cy="3006271"/>
+            <wp:effectExtent b="0" l="0" r="0" t="0"/>
+            <wp:docPr descr="" title="" id="87" name="Picture"/>
+            <a:graphic>
+              <a:graphicData uri="http://schemas.openxmlformats.org/drawingml/2006/picture">
+                <pic:pic>
+                  <pic:nvPicPr>
+                    <pic:cNvPr descr="08_live_replay.png" id="88" name="Picture"/>
+                    <pic:cNvPicPr>
+                      <a:picLocks noChangeArrowheads="1" noChangeAspect="1"/>
+                    </pic:cNvPicPr>
+                  </pic:nvPicPr>
+                  <pic:blipFill>
+                    <a:blip r:embed="rId86"/>
+                    <a:stretch>
+                      <a:fillRect/>
+                    </a:stretch>
+                  </pic:blipFill>
+                  <pic:spPr bwMode="auto">
+                    <a:xfrm>
+                      <a:off x="0" y="0"/>
+                      <a:ext cx="5334000" cy="3006271"/>
+                    </a:xfrm>
+                    <a:prstGeom prst="rect">
+                      <a:avLst/>
+                    </a:prstGeom>
+                    <a:noFill/>
+                    <a:ln w="9525">
+                      <a:noFill/>
+                      <a:headEnd/>
+                      <a:tailEnd/>
+                    </a:ln>
+                  </pic:spPr>
+                </pic:pic>
+              </a:graphicData>
+            </a:graphic>
+          </wp:inline>
+        </w:drawing>
+      </w:r>
+    </w:p>
+    <w:p>
+      <w:pPr>
+        <w:pStyle w:val="BodyText"/>
+      </w:pPr>
+      <w:r>
+        <w:rPr>
+          <w:bCs/>
+          <w:b/>
+        </w:rPr>
+        <w:t xml:space="preserve">/live: after the student answers</w:t>
+      </w:r>
+      <w:r>
+        <w:rPr>
+          <w:bCs/>
+          <w:b/>
+        </w:rPr>
+        <w:t xml:space="preserve"> </w:t>
+      </w:r>
+      <w:r>
+        <w:rPr>
+          <w:bCs/>
+          <w:b/>
+        </w:rPr>
+        <w:t xml:space="preserve">“</w:t>
+      </w:r>
+      <w:r>
+        <w:rPr>
+          <w:bCs/>
+          <w:b/>
+        </w:rPr>
+        <w:t xml:space="preserve">Someone asked me to move it</w:t>
+      </w:r>
+      <w:r>
+        <w:rPr>
+          <w:bCs/>
+          <w:b/>
+        </w:rPr>
+        <w:t xml:space="preserve">”</w:t>
+      </w:r>
+      <w:r>
+        <w:rPr>
+          <w:bCs/>
+          <w:b/>
+        </w:rPr>
+        <w:t xml:space="preserve">, a specialist takes over.</w:t>
+      </w:r>
+    </w:p>
+    <w:p>
+      <w:pPr>
+        <w:pStyle w:val="BodyText"/>
+      </w:pPr>
+      <w:r>
+        <w:drawing>
+          <wp:inline>
+            <wp:extent cx="5334000" cy="3006271"/>
+            <wp:effectExtent b="0" l="0" r="0" t="0"/>
+            <wp:docPr descr="" title="" id="90" name="Picture"/>
+            <a:graphic>
+              <a:graphicData uri="http://schemas.openxmlformats.org/drawingml/2006/picture">
+                <pic:pic>
+                  <pic:nvPicPr>
+                    <pic:cNvPr descr="09_live_specialist.png" id="91" name="Picture"/>
+                    <pic:cNvPicPr>
+                      <a:picLocks noChangeArrowheads="1" noChangeAspect="1"/>
+                    </pic:cNvPicPr>
+                  </pic:nvPicPr>
+                  <pic:blipFill>
+                    <a:blip r:embed="rId89"/>
+                    <a:stretch>
+                      <a:fillRect/>
+                    </a:stretch>
+                  </pic:blipFill>
+                  <pic:spPr bwMode="auto">
+                    <a:xfrm>
+                      <a:off x="0" y="0"/>
+                      <a:ext cx="5334000" cy="3006271"/>
+                    </a:xfrm>
+                    <a:prstGeom prst="rect">
+                      <a:avLst/>
+                    </a:prstGeom>
+                    <a:noFill/>
+                    <a:ln w="9525">
+                      <a:noFill/>
+                      <a:headEnd/>
+                      <a:tailEnd/>
+                    </a:ln>
+                  </pic:spPr>
+                </pic:pic>
+              </a:graphicData>
+            </a:graphic>
+          </wp:inline>
+        </w:drawing>
+      </w:r>
+    </w:p>
+    <w:bookmarkEnd w:id="92"/>
+    <w:bookmarkEnd w:id="93"/>
     <w:sectPr>
       <w:pgMar w:left="1296" w:right="1296" w:top="1152" w:bottom="1152"/>
     </w:sectPr>

</xml_diff>

<commit_message>
Add VM docker ps screenshot (README, report, deck)
Co-Authored-By: Claude Opus 5.5 <noreply@anthropic.com>
Claude-Session: https://claude.ai/code/session_01NWuP97XuxRF3YUECK7sHWt
</commit_message>
<xml_diff>
--- a/docs/StudentShield_Project_Report.docx
+++ b/docs/StudentShield_Project_Report.docx
@@ -2,7 +2,7 @@
 <file path=word/document.xml><?xml version="1.0" encoding="utf-8"?>
 <w:document xmlns:w="http://schemas.openxmlformats.org/wordprocessingml/2006/main" xmlns:m="http://schemas.openxmlformats.org/officeDocument/2006/math" xmlns:r="http://schemas.openxmlformats.org/officeDocument/2006/relationships" xmlns:o="urn:schemas-microsoft-com:office:office" xmlns:v="urn:schemas-microsoft-com:vml" xmlns:w10="urn:schemas-microsoft-com:office:word" xmlns:a="http://schemas.openxmlformats.org/drawingml/2006/main" xmlns:pic="http://schemas.openxmlformats.org/drawingml/2006/picture" xmlns:wp="http://schemas.openxmlformats.org/drawingml/2006/wordprocessingDrawing">
   <w:body>
-    <w:bookmarkStart w:id="93" w:name="X8d805a9bd98c36d0a93ad201b67fe0b3d81ba11"/>
+    <w:bookmarkStart w:id="96" w:name="X8d805a9bd98c36d0a93ad201b67fe0b3d81ba11"/>
     <w:p>
       <w:pPr>
         <w:pStyle w:val="Title"/>
@@ -12695,7 +12695,7 @@
       </w:r>
     </w:p>
     <w:bookmarkEnd w:id="67"/>
-    <w:bookmarkStart w:id="92" w:name="Xfc6ebf94ea804b2f44976b500b76ce99b440b82"/>
+    <w:bookmarkStart w:id="95" w:name="Xfc6ebf94ea804b2f44976b500b76ce99b440b82"/>
     <w:p>
       <w:pPr>
         <w:pStyle w:val="Heading2"/>
@@ -12898,7 +12898,7 @@
           <w:bCs/>
           <w:b/>
         </w:rPr>
-        <w:t xml:space="preserve">/demo: a real test-day case reaches the student level. The phone asks</w:t>
+        <w:t xml:space="preserve">VM terminal on LinuxONE:</w:t>
       </w:r>
       <w:r>
         <w:rPr>
@@ -12909,24 +12909,25 @@
       </w:r>
       <w:r>
         <w:rPr>
+          <w:rStyle w:val="VerbatimChar"/>
           <w:bCs/>
           <w:b/>
         </w:rPr>
-        <w:t xml:space="preserve">“</w:t>
+        <w:t xml:space="preserve">uname -m</w:t>
       </w:r>
       <w:r>
         <w:rPr>
           <w:bCs/>
           <w:b/>
         </w:rPr>
-        <w:t xml:space="preserve">Has someone asked you to move this money?</w:t>
+        <w:t xml:space="preserve"> </w:t>
       </w:r>
       <w:r>
         <w:rPr>
           <w:bCs/>
           <w:b/>
         </w:rPr>
-        <w:t xml:space="preserve">”</w:t>
+        <w:t xml:space="preserve">prints s390x, and</w:t>
       </w:r>
       <w:r>
         <w:rPr>
@@ -12937,10 +12938,25 @@
       </w:r>
       <w:r>
         <w:rPr>
+          <w:rStyle w:val="VerbatimChar"/>
           <w:bCs/>
           <w:b/>
         </w:rPr>
-        <w:t xml:space="preserve">while the analyst sees the score, money flow and reasons.</w:t>
+        <w:t xml:space="preserve">docker ps</w:t>
+      </w:r>
+      <w:r>
+        <w:rPr>
+          <w:bCs/>
+          <w:b/>
+        </w:rPr>
+        <w:t xml:space="preserve"> </w:t>
+      </w:r>
+      <w:r>
+        <w:rPr>
+          <w:bCs/>
+          <w:b/>
+        </w:rPr>
+        <w:t xml:space="preserve">shows the three containers. Only studentshield publishes port 5000; mule-service has no public port.</w:t>
       </w:r>
     </w:p>
     <w:p>
@@ -12950,14 +12966,14 @@
       <w:r>
         <w:drawing>
           <wp:inline>
-            <wp:extent cx="5334000" cy="3006271"/>
+            <wp:extent cx="5334000" cy="533400"/>
             <wp:effectExtent b="0" l="0" r="0" t="0"/>
             <wp:docPr descr="" title="" id="78" name="Picture"/>
             <a:graphic>
               <a:graphicData uri="http://schemas.openxmlformats.org/drawingml/2006/picture">
                 <pic:pic>
                   <pic:nvPicPr>
-                    <pic:cNvPr descr="05_demo_student_warning.png" id="79" name="Picture"/>
+                    <pic:cNvPr descr="04_vm_docker_ps.png" id="79" name="Picture"/>
                     <pic:cNvPicPr>
                       <a:picLocks noChangeArrowheads="1" noChangeAspect="1"/>
                     </pic:cNvPicPr>
@@ -12971,7 +12987,7 @@
                   <pic:spPr bwMode="auto">
                     <a:xfrm>
                       <a:off x="0" y="0"/>
-                      <a:ext cx="5334000" cy="3006271"/>
+                      <a:ext cx="5334000" cy="533400"/>
                     </a:xfrm>
                     <a:prstGeom prst="rect">
                       <a:avLst/>
@@ -12999,7 +13015,49 @@
           <w:bCs/>
           <w:b/>
         </w:rPr>
-        <w:t xml:space="preserve">/demo: a new flagged payment arrives after the student answered, so they are asked whether their answer still stands.</w:t>
+        <w:t xml:space="preserve">/demo: a real test-day case reaches the student level. The phone asks</w:t>
+      </w:r>
+      <w:r>
+        <w:rPr>
+          <w:bCs/>
+          <w:b/>
+        </w:rPr>
+        <w:t xml:space="preserve"> </w:t>
+      </w:r>
+      <w:r>
+        <w:rPr>
+          <w:bCs/>
+          <w:b/>
+        </w:rPr>
+        <w:t xml:space="preserve">“</w:t>
+      </w:r>
+      <w:r>
+        <w:rPr>
+          <w:bCs/>
+          <w:b/>
+        </w:rPr>
+        <w:t xml:space="preserve">Has someone asked you to move this money?</w:t>
+      </w:r>
+      <w:r>
+        <w:rPr>
+          <w:bCs/>
+          <w:b/>
+        </w:rPr>
+        <w:t xml:space="preserve">”</w:t>
+      </w:r>
+      <w:r>
+        <w:rPr>
+          <w:bCs/>
+          <w:b/>
+        </w:rPr>
+        <w:t xml:space="preserve"> </w:t>
+      </w:r>
+      <w:r>
+        <w:rPr>
+          <w:bCs/>
+          <w:b/>
+        </w:rPr>
+        <w:t xml:space="preserve">while the analyst sees the score, money flow and reasons.</w:t>
       </w:r>
     </w:p>
     <w:p>
@@ -13016,7 +13074,7 @@
               <a:graphicData uri="http://schemas.openxmlformats.org/drawingml/2006/picture">
                 <pic:pic>
                   <pic:nvPicPr>
-                    <pic:cNvPr descr="06_demo_reask.png" id="82" name="Picture"/>
+                    <pic:cNvPr descr="05_demo_student_warning.png" id="82" name="Picture"/>
                     <pic:cNvPicPr>
                       <a:picLocks noChangeArrowheads="1" noChangeAspect="1"/>
                     </pic:cNvPicPr>
@@ -13058,7 +13116,7 @@
           <w:bCs/>
           <w:b/>
         </w:rPr>
-        <w:t xml:space="preserve">/demo: the student was warned 19 h 17 min before the money moved out, and the outbound transfer of 7,731 was held for review.</w:t>
+        <w:t xml:space="preserve">/demo: a new flagged payment arrives after the student answered, so they are asked whether their answer still stands.</w:t>
       </w:r>
     </w:p>
     <w:p>
@@ -13075,7 +13133,7 @@
               <a:graphicData uri="http://schemas.openxmlformats.org/drawingml/2006/picture">
                 <pic:pic>
                   <pic:nvPicPr>
-                    <pic:cNvPr descr="07_demo_held_19h.png" id="85" name="Picture"/>
+                    <pic:cNvPr descr="06_demo_reask.png" id="85" name="Picture"/>
                     <pic:cNvPicPr>
                       <a:picLocks noChangeArrowheads="1" noChangeAspect="1"/>
                     </pic:cNvPicPr>
@@ -13117,7 +13175,7 @@
           <w:bCs/>
           <w:b/>
         </w:rPr>
-        <w:t xml:space="preserve">/live: full replay of the unseen test days on LinuxONE, averaging 0.55 ms per payment.</w:t>
+        <w:t xml:space="preserve">/demo: the student was warned 19 h 17 min before the money moved out, and the outbound transfer of 7,731 was held for review.</w:t>
       </w:r>
     </w:p>
     <w:p>
@@ -13134,7 +13192,7 @@
               <a:graphicData uri="http://schemas.openxmlformats.org/drawingml/2006/picture">
                 <pic:pic>
                   <pic:nvPicPr>
-                    <pic:cNvPr descr="08_live_replay.png" id="88" name="Picture"/>
+                    <pic:cNvPr descr="07_demo_held_19h.png" id="88" name="Picture"/>
                     <pic:cNvPicPr>
                       <a:picLocks noChangeArrowheads="1" noChangeAspect="1"/>
                     </pic:cNvPicPr>
@@ -13176,42 +13234,7 @@
           <w:bCs/>
           <w:b/>
         </w:rPr>
-        <w:t xml:space="preserve">/live: after the student answers</w:t>
-      </w:r>
-      <w:r>
-        <w:rPr>
-          <w:bCs/>
-          <w:b/>
-        </w:rPr>
-        <w:t xml:space="preserve"> </w:t>
-      </w:r>
-      <w:r>
-        <w:rPr>
-          <w:bCs/>
-          <w:b/>
-        </w:rPr>
-        <w:t xml:space="preserve">“</w:t>
-      </w:r>
-      <w:r>
-        <w:rPr>
-          <w:bCs/>
-          <w:b/>
-        </w:rPr>
-        <w:t xml:space="preserve">Someone asked me to move it</w:t>
-      </w:r>
-      <w:r>
-        <w:rPr>
-          <w:bCs/>
-          <w:b/>
-        </w:rPr>
-        <w:t xml:space="preserve">”</w:t>
-      </w:r>
-      <w:r>
-        <w:rPr>
-          <w:bCs/>
-          <w:b/>
-        </w:rPr>
-        <w:t xml:space="preserve">, a specialist takes over.</w:t>
+        <w:t xml:space="preserve">/live: full replay of the unseen test days on LinuxONE, averaging 0.55 ms per payment.</w:t>
       </w:r>
     </w:p>
     <w:p>
@@ -13228,7 +13251,7 @@
               <a:graphicData uri="http://schemas.openxmlformats.org/drawingml/2006/picture">
                 <pic:pic>
                   <pic:nvPicPr>
-                    <pic:cNvPr descr="09_live_specialist.png" id="91" name="Picture"/>
+                    <pic:cNvPr descr="08_live_replay.png" id="91" name="Picture"/>
                     <pic:cNvPicPr>
                       <a:picLocks noChangeArrowheads="1" noChangeAspect="1"/>
                     </pic:cNvPicPr>
@@ -13261,8 +13284,102 @@
         </w:drawing>
       </w:r>
     </w:p>
-    <w:bookmarkEnd w:id="92"/>
-    <w:bookmarkEnd w:id="93"/>
+    <w:p>
+      <w:pPr>
+        <w:pStyle w:val="BodyText"/>
+      </w:pPr>
+      <w:r>
+        <w:rPr>
+          <w:bCs/>
+          <w:b/>
+        </w:rPr>
+        <w:t xml:space="preserve">/live: after the student answers</w:t>
+      </w:r>
+      <w:r>
+        <w:rPr>
+          <w:bCs/>
+          <w:b/>
+        </w:rPr>
+        <w:t xml:space="preserve"> </w:t>
+      </w:r>
+      <w:r>
+        <w:rPr>
+          <w:bCs/>
+          <w:b/>
+        </w:rPr>
+        <w:t xml:space="preserve">“</w:t>
+      </w:r>
+      <w:r>
+        <w:rPr>
+          <w:bCs/>
+          <w:b/>
+        </w:rPr>
+        <w:t xml:space="preserve">Someone asked me to move it</w:t>
+      </w:r>
+      <w:r>
+        <w:rPr>
+          <w:bCs/>
+          <w:b/>
+        </w:rPr>
+        <w:t xml:space="preserve">”</w:t>
+      </w:r>
+      <w:r>
+        <w:rPr>
+          <w:bCs/>
+          <w:b/>
+        </w:rPr>
+        <w:t xml:space="preserve">, a specialist takes over.</w:t>
+      </w:r>
+    </w:p>
+    <w:p>
+      <w:pPr>
+        <w:pStyle w:val="BodyText"/>
+      </w:pPr>
+      <w:r>
+        <w:drawing>
+          <wp:inline>
+            <wp:extent cx="5334000" cy="3006271"/>
+            <wp:effectExtent b="0" l="0" r="0" t="0"/>
+            <wp:docPr descr="" title="" id="93" name="Picture"/>
+            <a:graphic>
+              <a:graphicData uri="http://schemas.openxmlformats.org/drawingml/2006/picture">
+                <pic:pic>
+                  <pic:nvPicPr>
+                    <pic:cNvPr descr="09_live_specialist.png" id="94" name="Picture"/>
+                    <pic:cNvPicPr>
+                      <a:picLocks noChangeArrowheads="1" noChangeAspect="1"/>
+                    </pic:cNvPicPr>
+                  </pic:nvPicPr>
+                  <pic:blipFill>
+                    <a:blip r:embed="rId92"/>
+                    <a:stretch>
+                      <a:fillRect/>
+                    </a:stretch>
+                  </pic:blipFill>
+                  <pic:spPr bwMode="auto">
+                    <a:xfrm>
+                      <a:off x="0" y="0"/>
+                      <a:ext cx="5334000" cy="3006271"/>
+                    </a:xfrm>
+                    <a:prstGeom prst="rect">
+                      <a:avLst/>
+                    </a:prstGeom>
+                    <a:noFill/>
+                    <a:ln w="9525">
+                      <a:noFill/>
+                      <a:headEnd/>
+                      <a:tailEnd/>
+                    </a:ln>
+                  </pic:spPr>
+                </pic:pic>
+              </a:graphicData>
+            </a:graphic>
+          </wp:inline>
+        </w:drawing>
+      </w:r>
+    </w:p>
+    <w:bookmarkEnd w:id="95"/>
+    <w:bookmarkEnd w:id="96"/>
     <w:sectPr>
       <w:pgMar w:left="1296" w:right="1296" w:top="1152" w:bottom="1152"/>
     </w:sectPr>

</xml_diff>